<commit_message>
feat: Enhance email functionality and update resume content. Updated email subject format in sendMail function and added HTML content for better email presentation. Revised resume to reflect recent experiences, including new certifications and project details, while improving formatting and clarity.
</commit_message>
<xml_diff>
--- a/public/BackendResume.docx
+++ b/public/BackendResume.docx
@@ -43,8 +43,20 @@
           <w:szCs w:val="18"/>
           <w:lang w:val="en-US"/>
         </w:rPr>
-        <w:t>Backend and DevOps Engineer at Oreyeon</w:t>
-      </w:r>
+        <w:t xml:space="preserve">Backend and DevOps Engineer at </w:t>
+      </w:r>
+      <w:proofErr w:type="spellStart"/>
+      <w:r>
+        <w:rPr>
+          <w:b/>
+          <w:bCs/>
+          <w:sz w:val="18"/>
+          <w:szCs w:val="18"/>
+          <w:lang w:val="en-US"/>
+        </w:rPr>
+        <w:t>Oreyeon</w:t>
+      </w:r>
+      <w:proofErr w:type="spellEnd"/>
     </w:p>
     <w:p>
       <w:pPr>
@@ -158,7 +170,7 @@
             <w:u w:val="single"/>
             <w:lang w:val="en-US"/>
           </w:rPr>
-          <w:t>assaadalhalabi@gmail.com</w:t>
+          <w:t>asaadalhalabi@gmail.com</w:t>
         </w:r>
       </w:hyperlink>
       <w:r>
@@ -175,6 +187,14 @@
           <w:szCs w:val="16"/>
           <w:lang w:val="en-US"/>
         </w:rPr>
+        <w:t xml:space="preserve"> </w:t>
+      </w:r>
+      <w:r>
+        <w:rPr>
+          <w:sz w:val="16"/>
+          <w:szCs w:val="16"/>
+          <w:lang w:val="en-US"/>
+        </w:rPr>
         <w:tab/>
       </w:r>
       <w:r>
@@ -192,6 +212,14 @@
           <w:lang w:val="en-US"/>
         </w:rPr>
         <w:tab/>
+        <w:t xml:space="preserve">                    </w:t>
+      </w:r>
+      <w:r>
+        <w:rPr>
+          <w:sz w:val="16"/>
+          <w:szCs w:val="16"/>
+          <w:lang w:val="en-US"/>
+        </w:rPr>
         <w:t xml:space="preserve">                    </w:t>
       </w:r>
       <w:r>
@@ -1248,7 +1276,7 @@
           <w:shd w:val="clear" w:color="auto" w:fill="FFFFFF"/>
           <w:lang w:val="en-US"/>
         </w:rPr>
-        <w:t xml:space="preserve">, </w:t>
+        <w:t>,</w:t>
       </w:r>
       <w:r>
         <w:rPr>
@@ -1258,7 +1286,7 @@
           <w:shd w:val="clear" w:color="auto" w:fill="FFFFFF"/>
           <w:lang w:val="en-US"/>
         </w:rPr>
-        <w:t>, ensuring the integrity of Federal Contract Information (FCI) and Controlled Unclassified Information (CUI)</w:t>
+        <w:t xml:space="preserve"> ensuring the integrity of Federal Contract Information (FCI) and Controlled Unclassified Information (CUI)</w:t>
       </w:r>
       <w:r>
         <w:rPr>
@@ -1782,6 +1810,7 @@
         <w:t xml:space="preserve"> </w:t>
       </w:r>
       <w:proofErr w:type="spellStart"/>
+      <w:proofErr w:type="gramStart"/>
       <w:r>
         <w:rPr>
           <w:sz w:val="20"/>
@@ -1797,6 +1826,7 @@
         </w:rPr>
         <w:t>:</w:t>
       </w:r>
+      <w:proofErr w:type="gramEnd"/>
       <w:r>
         <w:rPr>
           <w:sz w:val="16"/>
@@ -1929,6 +1959,8 @@
           <w:szCs w:val="18"/>
         </w:rPr>
       </w:pPr>
+      <w:proofErr w:type="spellStart"/>
+      <w:proofErr w:type="gramStart"/>
       <w:r>
         <w:rPr>
           <w:b/>
@@ -1937,66 +1969,95 @@
           <w:szCs w:val="18"/>
           <w:u w:val="single"/>
         </w:rPr>
-        <w:t>Programming:</w:t>
-      </w:r>
-      <w:r>
-        <w:rPr>
+        <w:t>Programming</w:t>
+      </w:r>
+      <w:proofErr w:type="spellEnd"/>
+      <w:r>
+        <w:rPr>
+          <w:b/>
+          <w:bCs/>
           <w:sz w:val="18"/>
           <w:szCs w:val="18"/>
-        </w:rPr>
-        <w:t xml:space="preserve"> Python,</w:t>
-      </w:r>
+          <w:u w:val="single"/>
+        </w:rPr>
+        <w:t>:</w:t>
+      </w:r>
+      <w:proofErr w:type="gramEnd"/>
       <w:r>
         <w:rPr>
           <w:sz w:val="18"/>
           <w:szCs w:val="18"/>
         </w:rPr>
-        <w:t xml:space="preserve"> </w:t>
+        <w:t xml:space="preserve"> Python,</w:t>
       </w:r>
       <w:r>
         <w:rPr>
           <w:sz w:val="18"/>
           <w:szCs w:val="18"/>
         </w:rPr>
-        <w:t>Java</w:t>
+        <w:t xml:space="preserve"> </w:t>
       </w:r>
       <w:r>
         <w:rPr>
           <w:sz w:val="18"/>
           <w:szCs w:val="18"/>
         </w:rPr>
-        <w:t>,</w:t>
+        <w:t>Java</w:t>
       </w:r>
       <w:r>
         <w:rPr>
           <w:sz w:val="18"/>
           <w:szCs w:val="18"/>
         </w:rPr>
-        <w:t xml:space="preserve"> Javascript, </w:t>
-      </w:r>
-      <w:proofErr w:type="spellStart"/>
+        <w:t>,</w:t>
+      </w:r>
       <w:r>
         <w:rPr>
           <w:sz w:val="18"/>
           <w:szCs w:val="18"/>
         </w:rPr>
-        <w:t>Typescript</w:t>
-      </w:r>
-      <w:proofErr w:type="spellEnd"/>
+        <w:t xml:space="preserve"> Javascript, </w:t>
+      </w:r>
+      <w:proofErr w:type="spellStart"/>
       <w:r>
         <w:rPr>
           <w:sz w:val="18"/>
           <w:szCs w:val="18"/>
         </w:rPr>
-        <w:t xml:space="preserve">, C++,  </w:t>
-      </w:r>
+        <w:t>Typescript</w:t>
+      </w:r>
+      <w:proofErr w:type="spellEnd"/>
       <w:r>
         <w:rPr>
           <w:sz w:val="18"/>
           <w:szCs w:val="18"/>
-          <w:lang w:val="en-US"/>
-        </w:rPr>
-        <w:t xml:space="preserve">Bash Scripting, </w:t>
+        </w:rPr>
+        <w:t xml:space="preserve">, </w:t>
+      </w:r>
+      <w:proofErr w:type="gramStart"/>
+      <w:r>
+        <w:rPr>
+          <w:sz w:val="18"/>
+          <w:szCs w:val="18"/>
+        </w:rPr>
+        <w:t xml:space="preserve">C++,  </w:t>
+      </w:r>
+      <w:r>
+        <w:rPr>
+          <w:sz w:val="18"/>
+          <w:szCs w:val="18"/>
+          <w:lang w:val="en-US"/>
+        </w:rPr>
+        <w:t>Bash</w:t>
+      </w:r>
+      <w:proofErr w:type="gramEnd"/>
+      <w:r>
+        <w:rPr>
+          <w:sz w:val="18"/>
+          <w:szCs w:val="18"/>
+          <w:lang w:val="en-US"/>
+        </w:rPr>
+        <w:t xml:space="preserve"> Scripting, </w:t>
       </w:r>
       <w:r>
         <w:rPr>
@@ -2070,15 +2131,7 @@
           <w:szCs w:val="18"/>
           <w:lang w:val="en-US"/>
         </w:rPr>
-        <w:t>SVN</w:t>
-      </w:r>
-      <w:r>
-        <w:rPr>
-          <w:sz w:val="18"/>
-          <w:szCs w:val="18"/>
-          <w:lang w:val="en-US"/>
-        </w:rPr>
-        <w:t>, Jenkins, Ansible</w:t>
+        <w:t>SVN, Jenkins, Ansible</w:t>
       </w:r>
     </w:p>
     <w:p>
@@ -2308,7 +2361,7 @@
           <w:u w:val="none"/>
           <w:lang w:val="en-US"/>
         </w:rPr>
-        <w:t xml:space="preserve"> Lebanon - Fast-Track to Senior Bootcamp 0</w:t>
+        <w:t xml:space="preserve"> - Fast-Track to Senior Bootcamp </w:t>
       </w:r>
       <w:r>
         <w:rPr>
@@ -2317,6 +2370,24 @@
           <w:u w:val="none"/>
           <w:lang w:val="en-US"/>
         </w:rPr>
+        <w:t xml:space="preserve">         </w:t>
+      </w:r>
+      <w:r>
+        <w:rPr>
+          <w:sz w:val="16"/>
+          <w:szCs w:val="16"/>
+          <w:u w:val="none"/>
+          <w:lang w:val="en-US"/>
+        </w:rPr>
+        <w:t>0</w:t>
+      </w:r>
+      <w:r>
+        <w:rPr>
+          <w:sz w:val="16"/>
+          <w:szCs w:val="16"/>
+          <w:u w:val="none"/>
+          <w:lang w:val="en-US"/>
+        </w:rPr>
         <w:t>4</w:t>
       </w:r>
       <w:r>
@@ -2326,7 +2397,16 @@
           <w:u w:val="none"/>
           <w:lang w:val="en-US"/>
         </w:rPr>
-        <w:t>/2024 – Present</w:t>
+        <w:t xml:space="preserve">/2024 – </w:t>
+      </w:r>
+      <w:r>
+        <w:rPr>
+          <w:sz w:val="16"/>
+          <w:szCs w:val="16"/>
+          <w:u w:val="none"/>
+          <w:lang w:val="en-US"/>
+        </w:rPr>
+        <w:t>08/2024</w:t>
       </w:r>
     </w:p>
     <w:p>
@@ -9740,6 +9820,7 @@
   <w:style w:type="character" w:default="1" w:styleId="DefaultParagraphFont">
     <w:name w:val="Default Paragraph Font"/>
     <w:uiPriority w:val="1"/>
+    <w:semiHidden/>
     <w:unhideWhenUsed/>
   </w:style>
   <w:style w:type="table" w:default="1" w:styleId="TableNormal">

</xml_diff>